<commit_message>
updated week 3 logbook, added RACI matrix and updated information regarding team member's specific roles and responsibilities
</commit_message>
<xml_diff>
--- a/Proposal working/Matt - Project Personnel.docx
+++ b/Proposal working/Matt - Project Personnel.docx
@@ -4100,7 +4100,7 @@
                                         </pic:cNvPicPr>
                                       </pic:nvPicPr>
                                       <pic:blipFill>
-                                        <a:blip r:embed="rId9">
+                                        <a:blip r:embed="rId8">
                                           <a:extLst>
                                             <a:ext uri="{28A0092B-C50C-407E-A947-70E740481C1C}">
                                               <a14:useLocalDpi xmlns:a14="http://schemas.microsoft.com/office/drawing/2010/main" val="0"/>
@@ -6773,14 +6773,49 @@
                 <w:highlight w:val="cyan"/>
                 <w:lang w:val="en-NZ"/>
               </w:rPr>
-              <w:t>Installation, configuration, research, troubleshooting, and implementation of software/tools/operating system required to support our investigation.</w:t>
+              <w:t>Installation, configuration, research, troubleshooting, and implementation of software/tools/operating system</w:t>
             </w:r>
             <w:r>
               <w:rPr>
                 <w:highlight w:val="cyan"/>
                 <w:lang w:val="en-NZ"/>
               </w:rPr>
-              <w:t xml:space="preserve"> Conducting comparative analysis on</w:t>
+              <w:t>s</w:t>
+            </w:r>
+            <w:r>
+              <w:rPr>
+                <w:highlight w:val="cyan"/>
+                <w:lang w:val="en-NZ"/>
+              </w:rPr>
+              <w:t xml:space="preserve"> required to support our investigation.</w:t>
+            </w:r>
+            <w:r>
+              <w:rPr>
+                <w:highlight w:val="cyan"/>
+                <w:lang w:val="en-NZ"/>
+              </w:rPr>
+              <w:t xml:space="preserve"> Integration of AI into our forensics tools.</w:t>
+            </w:r>
+            <w:r>
+              <w:rPr>
+                <w:highlight w:val="cyan"/>
+                <w:lang w:val="en-NZ"/>
+              </w:rPr>
+              <w:t xml:space="preserve"> </w:t>
+            </w:r>
+            <w:r>
+              <w:rPr>
+                <w:highlight w:val="cyan"/>
+                <w:lang w:val="en-NZ"/>
+              </w:rPr>
+              <w:t xml:space="preserve">Designing testing environments and </w:t>
+            </w:r>
+            <w:r>
+              <w:rPr>
+                <w:highlight w:val="cyan"/>
+                <w:lang w:val="en-NZ"/>
+              </w:rPr>
+              <w:t xml:space="preserve">performing forensic activities with legacy and AI based forensics tools, recording the results under a reliable doctrine. </w:t>
             </w:r>
           </w:p>
         </w:tc>
@@ -6856,7 +6891,21 @@
                 <w:highlight w:val="cyan"/>
                 <w:lang w:val="en-NZ"/>
               </w:rPr>
-              <w:t xml:space="preserve">power the AI models. Contribution to </w:t>
+              <w:t>power the AI models</w:t>
+            </w:r>
+            <w:r>
+              <w:rPr>
+                <w:highlight w:val="cyan"/>
+                <w:lang w:val="en-NZ"/>
+              </w:rPr>
+              <w:t>. Ensures that processing power is consistent before testing via benchmark. E</w:t>
+            </w:r>
+            <w:r>
+              <w:rPr>
+                <w:highlight w:val="cyan"/>
+                <w:lang w:val="en-NZ"/>
+              </w:rPr>
+              <w:t>mploying forensics tools during tests and communicating lessons from previous similar projects.</w:t>
             </w:r>
           </w:p>
         </w:tc>
@@ -6913,15 +6962,27 @@
                 <w:lang w:val="en-NZ"/>
               </w:rPr>
             </w:pPr>
-            <w:proofErr w:type="spellStart"/>
             <w:r>
               <w:rPr>
                 <w:highlight w:val="cyan"/>
                 <w:lang w:val="en-NZ"/>
               </w:rPr>
-              <w:t>Uhhhhhhmmm</w:t>
-            </w:r>
-            <w:proofErr w:type="spellEnd"/>
+              <w:t xml:space="preserve">Documentation, organization of evidence, forensic disk images and datasets, research material as well as partaking in the testing itself. Keeping track of testing documentation, </w:t>
+            </w:r>
+            <w:r>
+              <w:rPr>
+                <w:highlight w:val="cyan"/>
+                <w:lang w:val="en-NZ"/>
+              </w:rPr>
+              <w:t xml:space="preserve">organizing </w:t>
+            </w:r>
+            <w:r>
+              <w:rPr>
+                <w:highlight w:val="cyan"/>
+                <w:lang w:val="en-NZ"/>
+              </w:rPr>
+              <w:t>results for testing under diverse criteria.</w:t>
+            </w:r>
           </w:p>
         </w:tc>
       </w:tr>
@@ -6983,6 +7044,13 @@
                 <w:lang w:val="en-NZ"/>
               </w:rPr>
               <w:t>Organises meetings with the client/advisor, consolidates individual log hours into the group hours log, manages the git repository, contributes to collaborative documents and conducts research.</w:t>
+            </w:r>
+            <w:r>
+              <w:rPr>
+                <w:highlight w:val="cyan"/>
+                <w:lang w:val="en-NZ"/>
+              </w:rPr>
+              <w:t xml:space="preserve"> Ensures we are following the chosen methodology.</w:t>
             </w:r>
           </w:p>
         </w:tc>
@@ -7004,6 +7072,19 @@
         <w:t>Project Advisor</w:t>
       </w:r>
       <w:bookmarkEnd w:id="13"/>
+    </w:p>
+    <w:p>
+      <w:pPr>
+        <w:rPr>
+          <w:lang w:val="en-NZ"/>
+        </w:rPr>
+      </w:pPr>
+      <w:r>
+        <w:rPr>
+          <w:lang w:val="en-NZ"/>
+        </w:rPr>
+        <w:t>The project advisor for this project is Clement Swarnappa.</w:t>
+      </w:r>
     </w:p>
     <w:p>
       <w:pPr>
@@ -7022,13 +7103,14 @@
         <w:tblLook w:val="04A0" w:firstRow="1" w:lastRow="0" w:firstColumn="1" w:lastColumn="0" w:noHBand="0" w:noVBand="1"/>
       </w:tblPr>
       <w:tblGrid>
-        <w:gridCol w:w="4508"/>
-        <w:gridCol w:w="4508"/>
+        <w:gridCol w:w="3361"/>
+        <w:gridCol w:w="4134"/>
+        <w:gridCol w:w="2961"/>
       </w:tblGrid>
       <w:tr>
         <w:tc>
           <w:tcPr>
-            <w:tcW w:w="4508" w:type="dxa"/>
+            <w:tcW w:w="3361" w:type="dxa"/>
           </w:tcPr>
           <w:p>
             <w:pPr>
@@ -7046,7 +7128,7 @@
         </w:tc>
         <w:tc>
           <w:tcPr>
-            <w:tcW w:w="4508" w:type="dxa"/>
+            <w:tcW w:w="4134" w:type="dxa"/>
           </w:tcPr>
           <w:p>
             <w:pPr>
@@ -7059,6 +7141,24 @@
                 <w:lang w:val="en-NZ"/>
               </w:rPr>
               <w:t>Email address</w:t>
+            </w:r>
+          </w:p>
+        </w:tc>
+        <w:tc>
+          <w:tcPr>
+            <w:tcW w:w="2961" w:type="dxa"/>
+          </w:tcPr>
+          <w:p>
+            <w:pPr>
+              <w:rPr>
+                <w:lang w:val="en-NZ"/>
+              </w:rPr>
+            </w:pPr>
+            <w:r>
+              <w:rPr>
+                <w:lang w:val="en-NZ"/>
+              </w:rPr>
+              <w:t>Primary Method of Contact</w:t>
             </w:r>
           </w:p>
         </w:tc>
@@ -7066,31 +7166,25 @@
       <w:tr>
         <w:tc>
           <w:tcPr>
-            <w:tcW w:w="4508" w:type="dxa"/>
-          </w:tcPr>
-          <w:p>
-            <w:pPr>
-              <w:rPr>
-                <w:lang w:val="en-NZ"/>
-              </w:rPr>
-            </w:pPr>
-            <w:r>
-              <w:rPr>
-                <w:lang w:val="en-NZ"/>
-              </w:rPr>
-              <w:t>Client</w:t>
-            </w:r>
-            <w:r>
-              <w:rPr>
-                <w:lang w:val="en-NZ"/>
-              </w:rPr>
-              <w:t>: Geoff Gordon</w:t>
-            </w:r>
-          </w:p>
-        </w:tc>
-        <w:tc>
-          <w:tcPr>
-            <w:tcW w:w="4508" w:type="dxa"/>
+            <w:tcW w:w="3361" w:type="dxa"/>
+          </w:tcPr>
+          <w:p>
+            <w:pPr>
+              <w:rPr>
+                <w:lang w:val="en-NZ"/>
+              </w:rPr>
+            </w:pPr>
+            <w:r>
+              <w:rPr>
+                <w:lang w:val="en-NZ"/>
+              </w:rPr>
+              <w:t>Client: Geoff Gordon</w:t>
+            </w:r>
+          </w:p>
+        </w:tc>
+        <w:tc>
+          <w:tcPr>
+            <w:tcW w:w="4134" w:type="dxa"/>
           </w:tcPr>
           <w:p>
             <w:pPr>
@@ -7105,6 +7199,26 @@
                 <w:lang w:val="en-NZ"/>
               </w:rPr>
               <w:t>Geoff.Gordon@whitireia.ac.nz</w:t>
+            </w:r>
+          </w:p>
+        </w:tc>
+        <w:tc>
+          <w:tcPr>
+            <w:tcW w:w="2961" w:type="dxa"/>
+          </w:tcPr>
+          <w:p>
+            <w:pPr>
+              <w:rPr>
+                <w:highlight w:val="cyan"/>
+                <w:lang w:val="en-NZ"/>
+              </w:rPr>
+            </w:pPr>
+            <w:r>
+              <w:rPr>
+                <w:highlight w:val="cyan"/>
+                <w:lang w:val="en-NZ"/>
+              </w:rPr>
+              <w:t>Email</w:t>
             </w:r>
           </w:p>
         </w:tc>
@@ -7112,25 +7226,19 @@
       <w:tr>
         <w:tc>
           <w:tcPr>
-            <w:tcW w:w="4508" w:type="dxa"/>
-          </w:tcPr>
-          <w:p>
-            <w:pPr>
-              <w:rPr>
-                <w:lang w:val="en-NZ"/>
-              </w:rPr>
-            </w:pPr>
-            <w:r>
-              <w:rPr>
-                <w:lang w:val="en-NZ"/>
-              </w:rPr>
-              <w:t>Project advisor</w:t>
-            </w:r>
-            <w:r>
-              <w:rPr>
-                <w:lang w:val="en-NZ"/>
-              </w:rPr>
-              <w:t xml:space="preserve">: Clement </w:t>
+            <w:tcW w:w="3361" w:type="dxa"/>
+          </w:tcPr>
+          <w:p>
+            <w:pPr>
+              <w:rPr>
+                <w:lang w:val="en-NZ"/>
+              </w:rPr>
+            </w:pPr>
+            <w:r>
+              <w:rPr>
+                <w:lang w:val="en-NZ"/>
+              </w:rPr>
+              <w:t xml:space="preserve">Project advisor: Clement </w:t>
             </w:r>
             <w:proofErr w:type="spellStart"/>
             <w:r>
@@ -7144,7 +7252,7 @@
         </w:tc>
         <w:tc>
           <w:tcPr>
-            <w:tcW w:w="4508" w:type="dxa"/>
+            <w:tcW w:w="4134" w:type="dxa"/>
           </w:tcPr>
           <w:p>
             <w:pPr>
@@ -7159,6 +7267,26 @@
                 <w:lang w:val="en-NZ"/>
               </w:rPr>
               <w:t>Clement.Sudhakar@weltec.ac.nz</w:t>
+            </w:r>
+          </w:p>
+        </w:tc>
+        <w:tc>
+          <w:tcPr>
+            <w:tcW w:w="2961" w:type="dxa"/>
+          </w:tcPr>
+          <w:p>
+            <w:pPr>
+              <w:rPr>
+                <w:highlight w:val="cyan"/>
+                <w:lang w:val="en-NZ"/>
+              </w:rPr>
+            </w:pPr>
+            <w:r>
+              <w:rPr>
+                <w:highlight w:val="cyan"/>
+                <w:lang w:val="en-NZ"/>
+              </w:rPr>
+              <w:t>Email</w:t>
             </w:r>
           </w:p>
         </w:tc>
@@ -7166,37 +7294,25 @@
       <w:tr>
         <w:tc>
           <w:tcPr>
-            <w:tcW w:w="4508" w:type="dxa"/>
-          </w:tcPr>
-          <w:p>
-            <w:pPr>
-              <w:rPr>
-                <w:lang w:val="en-NZ"/>
-              </w:rPr>
-            </w:pPr>
-            <w:r>
-              <w:rPr>
-                <w:lang w:val="en-NZ"/>
-              </w:rPr>
-              <w:t>Group project manager</w:t>
-            </w:r>
-            <w:r>
-              <w:rPr>
-                <w:lang w:val="en-NZ"/>
-              </w:rPr>
-              <w:t xml:space="preserve">: </w:t>
-            </w:r>
-            <w:r>
-              <w:rPr>
-                <w:lang w:val="en-NZ"/>
-              </w:rPr>
-              <w:t>Dave Sushames</w:t>
-            </w:r>
-          </w:p>
-        </w:tc>
-        <w:tc>
-          <w:tcPr>
-            <w:tcW w:w="4508" w:type="dxa"/>
+            <w:tcW w:w="3361" w:type="dxa"/>
+          </w:tcPr>
+          <w:p>
+            <w:pPr>
+              <w:rPr>
+                <w:lang w:val="en-NZ"/>
+              </w:rPr>
+            </w:pPr>
+            <w:r>
+              <w:rPr>
+                <w:lang w:val="en-NZ"/>
+              </w:rPr>
+              <w:t>Group project manager: Dave Sushames</w:t>
+            </w:r>
+          </w:p>
+        </w:tc>
+        <w:tc>
+          <w:tcPr>
+            <w:tcW w:w="4134" w:type="dxa"/>
           </w:tcPr>
           <w:p>
             <w:pPr>
@@ -7211,6 +7327,26 @@
                 <w:lang w:val="en-NZ"/>
               </w:rPr>
               <w:t>david.sushames@gmail.com</w:t>
+            </w:r>
+          </w:p>
+        </w:tc>
+        <w:tc>
+          <w:tcPr>
+            <w:tcW w:w="2961" w:type="dxa"/>
+          </w:tcPr>
+          <w:p>
+            <w:pPr>
+              <w:rPr>
+                <w:highlight w:val="cyan"/>
+                <w:lang w:val="en-NZ"/>
+              </w:rPr>
+            </w:pPr>
+            <w:r>
+              <w:rPr>
+                <w:highlight w:val="cyan"/>
+                <w:lang w:val="en-NZ"/>
+              </w:rPr>
+              <w:t>Discord</w:t>
             </w:r>
           </w:p>
         </w:tc>
@@ -7218,31 +7354,25 @@
       <w:tr>
         <w:tc>
           <w:tcPr>
-            <w:tcW w:w="4508" w:type="dxa"/>
-          </w:tcPr>
-          <w:p>
-            <w:pPr>
-              <w:rPr>
-                <w:lang w:val="en-NZ"/>
-              </w:rPr>
-            </w:pPr>
-            <w:r>
-              <w:rPr>
-                <w:lang w:val="en-NZ"/>
-              </w:rPr>
-              <w:t>Group member</w:t>
-            </w:r>
-            <w:r>
-              <w:rPr>
-                <w:lang w:val="en-NZ"/>
-              </w:rPr>
-              <w:t>: Olivia Hey</w:t>
-            </w:r>
-          </w:p>
-        </w:tc>
-        <w:tc>
-          <w:tcPr>
-            <w:tcW w:w="4508" w:type="dxa"/>
+            <w:tcW w:w="3361" w:type="dxa"/>
+          </w:tcPr>
+          <w:p>
+            <w:pPr>
+              <w:rPr>
+                <w:lang w:val="en-NZ"/>
+              </w:rPr>
+            </w:pPr>
+            <w:r>
+              <w:rPr>
+                <w:lang w:val="en-NZ"/>
+              </w:rPr>
+              <w:t>Group member: Olivia Hey</w:t>
+            </w:r>
+          </w:p>
+        </w:tc>
+        <w:tc>
+          <w:tcPr>
+            <w:tcW w:w="4134" w:type="dxa"/>
           </w:tcPr>
           <w:p>
             <w:pPr>
@@ -7273,6 +7403,26 @@
                 <w:lang w:val="en-NZ"/>
               </w:rPr>
               <w:t>01</w:t>
+            </w:r>
+          </w:p>
+        </w:tc>
+        <w:tc>
+          <w:tcPr>
+            <w:tcW w:w="2961" w:type="dxa"/>
+          </w:tcPr>
+          <w:p>
+            <w:pPr>
+              <w:rPr>
+                <w:highlight w:val="cyan"/>
+                <w:lang w:val="en-NZ"/>
+              </w:rPr>
+            </w:pPr>
+            <w:r>
+              <w:rPr>
+                <w:highlight w:val="cyan"/>
+                <w:lang w:val="en-NZ"/>
+              </w:rPr>
+              <w:t>Discord</w:t>
             </w:r>
           </w:p>
         </w:tc>
@@ -7280,31 +7430,26 @@
       <w:tr>
         <w:tc>
           <w:tcPr>
-            <w:tcW w:w="4508" w:type="dxa"/>
-          </w:tcPr>
-          <w:p>
-            <w:pPr>
-              <w:rPr>
-                <w:lang w:val="en-NZ"/>
-              </w:rPr>
-            </w:pPr>
-            <w:r>
-              <w:rPr>
-                <w:lang w:val="en-NZ"/>
-              </w:rPr>
-              <w:t>Group member</w:t>
-            </w:r>
-            <w:r>
-              <w:rPr>
-                <w:lang w:val="en-NZ"/>
-              </w:rPr>
-              <w:t>: Matt Baker</w:t>
-            </w:r>
-          </w:p>
-        </w:tc>
-        <w:tc>
-          <w:tcPr>
-            <w:tcW w:w="4508" w:type="dxa"/>
+            <w:tcW w:w="3361" w:type="dxa"/>
+          </w:tcPr>
+          <w:p>
+            <w:pPr>
+              <w:rPr>
+                <w:lang w:val="en-NZ"/>
+              </w:rPr>
+            </w:pPr>
+            <w:r>
+              <w:rPr>
+                <w:lang w:val="en-NZ"/>
+              </w:rPr>
+              <w:lastRenderedPageBreak/>
+              <w:t>Group member: Matt Baker</w:t>
+            </w:r>
+          </w:p>
+        </w:tc>
+        <w:tc>
+          <w:tcPr>
+            <w:tcW w:w="4134" w:type="dxa"/>
           </w:tcPr>
           <w:p>
             <w:pPr>
@@ -7318,6 +7463,26 @@
                 <w:lang w:val="en-NZ"/>
               </w:rPr>
               <w:t>mattwillbaker1@gmail.com</w:t>
+            </w:r>
+          </w:p>
+        </w:tc>
+        <w:tc>
+          <w:tcPr>
+            <w:tcW w:w="2961" w:type="dxa"/>
+          </w:tcPr>
+          <w:p>
+            <w:pPr>
+              <w:rPr>
+                <w:highlight w:val="cyan"/>
+                <w:lang w:val="en-NZ"/>
+              </w:rPr>
+            </w:pPr>
+            <w:r>
+              <w:rPr>
+                <w:highlight w:val="cyan"/>
+                <w:lang w:val="en-NZ"/>
+              </w:rPr>
+              <w:t>Discord</w:t>
             </w:r>
           </w:p>
         </w:tc>
@@ -7325,7 +7490,7 @@
       <w:tr>
         <w:tc>
           <w:tcPr>
-            <w:tcW w:w="4508" w:type="dxa"/>
+            <w:tcW w:w="3361" w:type="dxa"/>
           </w:tcPr>
           <w:p>
             <w:pPr>
@@ -7343,7 +7508,7 @@
         </w:tc>
         <w:tc>
           <w:tcPr>
-            <w:tcW w:w="4508" w:type="dxa"/>
+            <w:tcW w:w="4134" w:type="dxa"/>
           </w:tcPr>
           <w:p>
             <w:pPr>
@@ -7358,6 +7523,27 @@
                 <w:lang w:val="en-NZ"/>
               </w:rPr>
               <w:t>Samueldavies0220@gmail.com</w:t>
+            </w:r>
+          </w:p>
+        </w:tc>
+        <w:tc>
+          <w:tcPr>
+            <w:tcW w:w="2961" w:type="dxa"/>
+          </w:tcPr>
+          <w:p>
+            <w:pPr>
+              <w:keepNext/>
+              <w:rPr>
+                <w:highlight w:val="cyan"/>
+                <w:lang w:val="en-NZ"/>
+              </w:rPr>
+            </w:pPr>
+            <w:r>
+              <w:rPr>
+                <w:highlight w:val="cyan"/>
+                <w:lang w:val="en-NZ"/>
+              </w:rPr>
+              <w:t>Discord</w:t>
             </w:r>
           </w:p>
         </w:tc>
@@ -7417,9 +7603,62 @@
           <w:rFonts w:cs="Arial"/>
           <w:sz w:val="24"/>
           <w:szCs w:val="24"/>
+          <w:highlight w:val="cyan"/>
           <w:lang w:val="en-NZ"/>
         </w:rPr>
         <w:t xml:space="preserve">As our client </w:t>
+      </w:r>
+      <w:r>
+        <w:rPr>
+          <w:rFonts w:cs="Arial"/>
+          <w:sz w:val="24"/>
+          <w:szCs w:val="24"/>
+          <w:highlight w:val="cyan"/>
+          <w:lang w:val="en-NZ"/>
+        </w:rPr>
+        <w:t xml:space="preserve">Geoff Gordon is a member of the </w:t>
+      </w:r>
+      <w:proofErr w:type="spellStart"/>
+      <w:r>
+        <w:rPr>
+          <w:rFonts w:cs="Arial"/>
+          <w:sz w:val="24"/>
+          <w:szCs w:val="24"/>
+          <w:highlight w:val="cyan"/>
+          <w:lang w:val="en-NZ"/>
+        </w:rPr>
+        <w:t>WelTec</w:t>
+      </w:r>
+      <w:proofErr w:type="spellEnd"/>
+      <w:r>
+        <w:rPr>
+          <w:rFonts w:cs="Arial"/>
+          <w:sz w:val="24"/>
+          <w:szCs w:val="24"/>
+          <w:highlight w:val="cyan"/>
+          <w:lang w:val="en-NZ"/>
+        </w:rPr>
+        <w:t xml:space="preserve"> staff, </w:t>
+      </w:r>
+      <w:r>
+        <w:rPr>
+          <w:rFonts w:cs="Arial"/>
+          <w:sz w:val="24"/>
+          <w:szCs w:val="24"/>
+          <w:highlight w:val="cyan"/>
+          <w:lang w:val="en-NZ"/>
+        </w:rPr>
+        <w:t>his employer is the same as the institution that runs this capstone course, this constitutes a conflict of interest</w:t>
+      </w:r>
+      <w:r>
+        <w:rPr>
+          <w:rFonts w:cs="Arial"/>
+          <w:sz w:val="24"/>
+          <w:szCs w:val="24"/>
+          <w:highlight w:val="cyan"/>
+          <w:lang w:val="en-NZ"/>
+        </w:rPr>
+        <w:t>. The prevailing vague familiarity with Geoff within the team also means a relationship exists that could compromise the sincerity of the transaction of client to student.</w:t>
       </w:r>
       <w:r>
         <w:rPr>
@@ -7428,27 +7667,7 @@
           <w:szCs w:val="24"/>
           <w:lang w:val="en-NZ"/>
         </w:rPr>
-        <w:t xml:space="preserve">Geoff Gordon is a member of the </w:t>
-      </w:r>
-      <w:proofErr w:type="spellStart"/>
-      <w:r>
-        <w:rPr>
-          <w:rFonts w:cs="Arial"/>
-          <w:sz w:val="24"/>
-          <w:szCs w:val="24"/>
-          <w:lang w:val="en-NZ"/>
-        </w:rPr>
-        <w:t>WelTec</w:t>
-      </w:r>
-      <w:proofErr w:type="spellEnd"/>
-      <w:r>
-        <w:rPr>
-          <w:rFonts w:cs="Arial"/>
-          <w:sz w:val="24"/>
-          <w:szCs w:val="24"/>
-          <w:lang w:val="en-NZ"/>
-        </w:rPr>
-        <w:t xml:space="preserve"> staff, </w:t>
+        <w:t xml:space="preserve"> </w:t>
       </w:r>
     </w:p>
     <w:p>
@@ -7457,10 +7676,1764 @@
       </w:pPr>
       <w:bookmarkStart w:id="16" w:name="_Toc236665781"/>
       <w:r>
-        <w:lastRenderedPageBreak/>
         <w:t>RACI assessment matrix</w:t>
       </w:r>
       <w:bookmarkEnd w:id="16"/>
+    </w:p>
+    <w:p>
+      <w:pPr>
+        <w:rPr>
+          <w:lang w:val="en-NZ"/>
+        </w:rPr>
+      </w:pPr>
+      <w:r>
+        <w:rPr>
+          <w:lang w:val="en-NZ"/>
+        </w:rPr>
+        <w:t xml:space="preserve">This matrix divulges the relative responsibility the stakeholders of this project possess with regards to each task. </w:t>
+      </w:r>
+      <w:r>
+        <w:rPr>
+          <w:highlight w:val="red"/>
+          <w:lang w:val="en-NZ"/>
+        </w:rPr>
+        <w:t>R – Responsible</w:t>
+      </w:r>
+      <w:r>
+        <w:rPr>
+          <w:lang w:val="en-NZ"/>
+        </w:rPr>
+        <w:t xml:space="preserve"> </w:t>
+      </w:r>
+      <w:r>
+        <w:rPr>
+          <w:highlight w:val="magenta"/>
+          <w:lang w:val="en-NZ"/>
+        </w:rPr>
+        <w:t>A – Accountable</w:t>
+      </w:r>
+      <w:r>
+        <w:rPr>
+          <w:lang w:val="en-NZ"/>
+        </w:rPr>
+        <w:t xml:space="preserve"> </w:t>
+      </w:r>
+      <w:r>
+        <w:rPr>
+          <w:highlight w:val="yellow"/>
+          <w:lang w:val="en-NZ"/>
+        </w:rPr>
+        <w:t>C – Consulted</w:t>
+      </w:r>
+      <w:r>
+        <w:rPr>
+          <w:lang w:val="en-NZ"/>
+        </w:rPr>
+        <w:t xml:space="preserve"> </w:t>
+      </w:r>
+      <w:r>
+        <w:rPr>
+          <w:highlight w:val="green"/>
+          <w:lang w:val="en-NZ"/>
+        </w:rPr>
+        <w:t>I - Informed</w:t>
+      </w:r>
+    </w:p>
+    <w:p>
+      <w:pPr>
+        <w:rPr>
+          <w:lang w:val="en-NZ"/>
+        </w:rPr>
+      </w:pPr>
+    </w:p>
+    <w:tbl>
+      <w:tblPr>
+        <w:tblStyle w:val="TableGrid"/>
+        <w:tblW w:w="0" w:type="auto"/>
+        <w:tblLook w:val="04A0" w:firstRow="1" w:lastRow="0" w:firstColumn="1" w:lastColumn="0" w:noHBand="0" w:noVBand="1"/>
+      </w:tblPr>
+      <w:tblGrid>
+        <w:gridCol w:w="2857"/>
+        <w:gridCol w:w="1255"/>
+        <w:gridCol w:w="1482"/>
+        <w:gridCol w:w="1439"/>
+        <w:gridCol w:w="1162"/>
+        <w:gridCol w:w="1147"/>
+        <w:gridCol w:w="1114"/>
+      </w:tblGrid>
+      <w:tr>
+        <w:tc>
+          <w:tcPr>
+            <w:tcW w:w="2857" w:type="dxa"/>
+          </w:tcPr>
+          <w:p>
+            <w:pPr>
+              <w:rPr>
+                <w:highlight w:val="cyan"/>
+                <w:lang w:val="en-NZ"/>
+              </w:rPr>
+            </w:pPr>
+            <w:r>
+              <w:rPr>
+                <w:highlight w:val="cyan"/>
+                <w:lang w:val="en-NZ"/>
+              </w:rPr>
+              <w:t>Tasks</w:t>
+            </w:r>
+          </w:p>
+        </w:tc>
+        <w:tc>
+          <w:tcPr>
+            <w:tcW w:w="1255" w:type="dxa"/>
+          </w:tcPr>
+          <w:p>
+            <w:pPr>
+              <w:rPr>
+                <w:highlight w:val="cyan"/>
+                <w:lang w:val="en-NZ"/>
+              </w:rPr>
+            </w:pPr>
+            <w:r>
+              <w:rPr>
+                <w:highlight w:val="cyan"/>
+                <w:lang w:val="en-NZ"/>
+              </w:rPr>
+              <w:t>Geoff Gordon (Client)</w:t>
+            </w:r>
+          </w:p>
+        </w:tc>
+        <w:tc>
+          <w:tcPr>
+            <w:tcW w:w="1482" w:type="dxa"/>
+          </w:tcPr>
+          <w:p>
+            <w:pPr>
+              <w:rPr>
+                <w:highlight w:val="cyan"/>
+                <w:lang w:val="en-NZ"/>
+              </w:rPr>
+            </w:pPr>
+            <w:r>
+              <w:rPr>
+                <w:highlight w:val="cyan"/>
+                <w:lang w:val="en-NZ"/>
+              </w:rPr>
+              <w:t xml:space="preserve">Clement </w:t>
+            </w:r>
+            <w:proofErr w:type="spellStart"/>
+            <w:r>
+              <w:rPr>
+                <w:highlight w:val="cyan"/>
+                <w:lang w:val="en-NZ"/>
+              </w:rPr>
+              <w:t>Swarnappa</w:t>
+            </w:r>
+            <w:proofErr w:type="spellEnd"/>
+            <w:r>
+              <w:rPr>
+                <w:highlight w:val="cyan"/>
+                <w:lang w:val="en-NZ"/>
+              </w:rPr>
+              <w:t xml:space="preserve"> (Advisor)</w:t>
+            </w:r>
+          </w:p>
+        </w:tc>
+        <w:tc>
+          <w:tcPr>
+            <w:tcW w:w="1439" w:type="dxa"/>
+          </w:tcPr>
+          <w:p>
+            <w:pPr>
+              <w:rPr>
+                <w:highlight w:val="cyan"/>
+                <w:lang w:val="en-NZ"/>
+              </w:rPr>
+            </w:pPr>
+            <w:r>
+              <w:rPr>
+                <w:highlight w:val="cyan"/>
+                <w:lang w:val="en-NZ"/>
+              </w:rPr>
+              <w:t>Dave Sushames (PM)</w:t>
+            </w:r>
+          </w:p>
+        </w:tc>
+        <w:tc>
+          <w:tcPr>
+            <w:tcW w:w="1162" w:type="dxa"/>
+          </w:tcPr>
+          <w:p>
+            <w:pPr>
+              <w:rPr>
+                <w:highlight w:val="cyan"/>
+                <w:lang w:val="en-NZ"/>
+              </w:rPr>
+            </w:pPr>
+            <w:r>
+              <w:rPr>
+                <w:highlight w:val="cyan"/>
+                <w:lang w:val="en-NZ"/>
+              </w:rPr>
+              <w:t>Matt Baker</w:t>
+            </w:r>
+          </w:p>
+        </w:tc>
+        <w:tc>
+          <w:tcPr>
+            <w:tcW w:w="1147" w:type="dxa"/>
+          </w:tcPr>
+          <w:p>
+            <w:pPr>
+              <w:rPr>
+                <w:highlight w:val="cyan"/>
+                <w:lang w:val="en-NZ"/>
+              </w:rPr>
+            </w:pPr>
+            <w:r>
+              <w:rPr>
+                <w:highlight w:val="cyan"/>
+                <w:lang w:val="en-NZ"/>
+              </w:rPr>
+              <w:t>Olivia Hey</w:t>
+            </w:r>
+          </w:p>
+        </w:tc>
+        <w:tc>
+          <w:tcPr>
+            <w:tcW w:w="1114" w:type="dxa"/>
+          </w:tcPr>
+          <w:p>
+            <w:pPr>
+              <w:rPr>
+                <w:highlight w:val="cyan"/>
+                <w:lang w:val="en-NZ"/>
+              </w:rPr>
+            </w:pPr>
+            <w:r>
+              <w:rPr>
+                <w:highlight w:val="cyan"/>
+                <w:lang w:val="en-NZ"/>
+              </w:rPr>
+              <w:t>Sam Davies</w:t>
+            </w:r>
+          </w:p>
+        </w:tc>
+      </w:tr>
+      <w:tr>
+        <w:tc>
+          <w:tcPr>
+            <w:tcW w:w="2857" w:type="dxa"/>
+          </w:tcPr>
+          <w:p>
+            <w:pPr>
+              <w:rPr>
+                <w:highlight w:val="cyan"/>
+                <w:lang w:val="en-NZ"/>
+              </w:rPr>
+            </w:pPr>
+            <w:r>
+              <w:rPr>
+                <w:highlight w:val="cyan"/>
+                <w:lang w:val="en-NZ"/>
+              </w:rPr>
+              <w:t>Installation, management of physical hardware.</w:t>
+            </w:r>
+          </w:p>
+        </w:tc>
+        <w:tc>
+          <w:tcPr>
+            <w:tcW w:w="1255" w:type="dxa"/>
+          </w:tcPr>
+          <w:p>
+            <w:pPr>
+              <w:rPr>
+                <w:lang w:val="en-NZ"/>
+              </w:rPr>
+            </w:pPr>
+            <w:r>
+              <w:rPr>
+                <w:highlight w:val="red"/>
+                <w:lang w:val="en-NZ"/>
+              </w:rPr>
+              <w:t>R</w:t>
+            </w:r>
+          </w:p>
+        </w:tc>
+        <w:tc>
+          <w:tcPr>
+            <w:tcW w:w="1482" w:type="dxa"/>
+          </w:tcPr>
+          <w:p>
+            <w:pPr>
+              <w:rPr>
+                <w:lang w:val="en-NZ"/>
+              </w:rPr>
+            </w:pPr>
+            <w:r>
+              <w:rPr>
+                <w:highlight w:val="green"/>
+                <w:lang w:val="en-NZ"/>
+              </w:rPr>
+              <w:t>I</w:t>
+            </w:r>
+          </w:p>
+        </w:tc>
+        <w:tc>
+          <w:tcPr>
+            <w:tcW w:w="1439" w:type="dxa"/>
+          </w:tcPr>
+          <w:p>
+            <w:pPr>
+              <w:rPr>
+                <w:highlight w:val="yellow"/>
+                <w:lang w:val="en-NZ"/>
+              </w:rPr>
+            </w:pPr>
+            <w:r>
+              <w:rPr>
+                <w:highlight w:val="yellow"/>
+                <w:lang w:val="en-NZ"/>
+              </w:rPr>
+              <w:t>C</w:t>
+            </w:r>
+          </w:p>
+        </w:tc>
+        <w:tc>
+          <w:tcPr>
+            <w:tcW w:w="1162" w:type="dxa"/>
+          </w:tcPr>
+          <w:p>
+            <w:pPr>
+              <w:rPr>
+                <w:highlight w:val="yellow"/>
+                <w:lang w:val="en-NZ"/>
+              </w:rPr>
+            </w:pPr>
+            <w:r>
+              <w:rPr>
+                <w:highlight w:val="yellow"/>
+                <w:lang w:val="en-NZ"/>
+              </w:rPr>
+              <w:t>C</w:t>
+            </w:r>
+          </w:p>
+        </w:tc>
+        <w:tc>
+          <w:tcPr>
+            <w:tcW w:w="1147" w:type="dxa"/>
+          </w:tcPr>
+          <w:p>
+            <w:pPr>
+              <w:rPr>
+                <w:highlight w:val="yellow"/>
+                <w:lang w:val="en-NZ"/>
+              </w:rPr>
+            </w:pPr>
+            <w:r>
+              <w:rPr>
+                <w:highlight w:val="yellow"/>
+                <w:lang w:val="en-NZ"/>
+              </w:rPr>
+              <w:t>C</w:t>
+            </w:r>
+          </w:p>
+        </w:tc>
+        <w:tc>
+          <w:tcPr>
+            <w:tcW w:w="1114" w:type="dxa"/>
+          </w:tcPr>
+          <w:p>
+            <w:pPr>
+              <w:rPr>
+                <w:lang w:val="en-NZ"/>
+              </w:rPr>
+            </w:pPr>
+            <w:r>
+              <w:rPr>
+                <w:highlight w:val="red"/>
+                <w:lang w:val="en-NZ"/>
+              </w:rPr>
+              <w:t>R</w:t>
+            </w:r>
+          </w:p>
+        </w:tc>
+      </w:tr>
+      <w:tr>
+        <w:tc>
+          <w:tcPr>
+            <w:tcW w:w="2857" w:type="dxa"/>
+          </w:tcPr>
+          <w:p>
+            <w:pPr>
+              <w:rPr>
+                <w:highlight w:val="cyan"/>
+                <w:lang w:val="en-NZ"/>
+              </w:rPr>
+            </w:pPr>
+            <w:r>
+              <w:rPr>
+                <w:highlight w:val="cyan"/>
+                <w:lang w:val="en-NZ"/>
+              </w:rPr>
+              <w:t>Installation/configuration of operating systems and software (</w:t>
+            </w:r>
+            <w:proofErr w:type="spellStart"/>
+            <w:r>
+              <w:rPr>
+                <w:highlight w:val="cyan"/>
+                <w:lang w:val="en-NZ"/>
+              </w:rPr>
+              <w:t>LMStudio</w:t>
+            </w:r>
+            <w:proofErr w:type="spellEnd"/>
+            <w:r>
+              <w:rPr>
+                <w:highlight w:val="cyan"/>
+                <w:lang w:val="en-NZ"/>
+              </w:rPr>
+              <w:t>, forensic tools such as volatility/</w:t>
+            </w:r>
+            <w:proofErr w:type="spellStart"/>
+            <w:r>
+              <w:rPr>
+                <w:highlight w:val="cyan"/>
+                <w:lang w:val="en-NZ"/>
+              </w:rPr>
+              <w:t>exiftools</w:t>
+            </w:r>
+            <w:proofErr w:type="spellEnd"/>
+            <w:r>
+              <w:rPr>
+                <w:highlight w:val="cyan"/>
+                <w:lang w:val="en-NZ"/>
+              </w:rPr>
+              <w:t>/foremost)</w:t>
+            </w:r>
+          </w:p>
+        </w:tc>
+        <w:tc>
+          <w:tcPr>
+            <w:tcW w:w="1255" w:type="dxa"/>
+          </w:tcPr>
+          <w:p>
+            <w:pPr>
+              <w:rPr>
+                <w:lang w:val="en-NZ"/>
+              </w:rPr>
+            </w:pPr>
+            <w:r>
+              <w:rPr>
+                <w:highlight w:val="yellow"/>
+                <w:lang w:val="en-NZ"/>
+              </w:rPr>
+              <w:t>C</w:t>
+            </w:r>
+          </w:p>
+        </w:tc>
+        <w:tc>
+          <w:tcPr>
+            <w:tcW w:w="1482" w:type="dxa"/>
+          </w:tcPr>
+          <w:p>
+            <w:pPr>
+              <w:rPr>
+                <w:highlight w:val="green"/>
+                <w:lang w:val="en-NZ"/>
+              </w:rPr>
+            </w:pPr>
+            <w:r>
+              <w:rPr>
+                <w:highlight w:val="green"/>
+                <w:lang w:val="en-NZ"/>
+              </w:rPr>
+              <w:t>I</w:t>
+            </w:r>
+          </w:p>
+        </w:tc>
+        <w:tc>
+          <w:tcPr>
+            <w:tcW w:w="1439" w:type="dxa"/>
+          </w:tcPr>
+          <w:p>
+            <w:pPr>
+              <w:rPr>
+                <w:highlight w:val="green"/>
+                <w:lang w:val="en-NZ"/>
+              </w:rPr>
+            </w:pPr>
+            <w:r>
+              <w:rPr>
+                <w:highlight w:val="green"/>
+                <w:lang w:val="en-NZ"/>
+              </w:rPr>
+              <w:t>I</w:t>
+            </w:r>
+          </w:p>
+        </w:tc>
+        <w:tc>
+          <w:tcPr>
+            <w:tcW w:w="1162" w:type="dxa"/>
+          </w:tcPr>
+          <w:p>
+            <w:pPr>
+              <w:rPr>
+                <w:lang w:val="en-NZ"/>
+              </w:rPr>
+            </w:pPr>
+            <w:r>
+              <w:rPr>
+                <w:highlight w:val="red"/>
+                <w:lang w:val="en-NZ"/>
+              </w:rPr>
+              <w:t>R</w:t>
+            </w:r>
+          </w:p>
+        </w:tc>
+        <w:tc>
+          <w:tcPr>
+            <w:tcW w:w="1147" w:type="dxa"/>
+          </w:tcPr>
+          <w:p>
+            <w:pPr>
+              <w:rPr>
+                <w:lang w:val="en-NZ"/>
+              </w:rPr>
+            </w:pPr>
+            <w:r>
+              <w:rPr>
+                <w:highlight w:val="magenta"/>
+                <w:lang w:val="en-NZ"/>
+              </w:rPr>
+              <w:t>A</w:t>
+            </w:r>
+          </w:p>
+        </w:tc>
+        <w:tc>
+          <w:tcPr>
+            <w:tcW w:w="1114" w:type="dxa"/>
+          </w:tcPr>
+          <w:p>
+            <w:pPr>
+              <w:rPr>
+                <w:lang w:val="en-NZ"/>
+              </w:rPr>
+            </w:pPr>
+            <w:r>
+              <w:rPr>
+                <w:highlight w:val="magenta"/>
+                <w:lang w:val="en-NZ"/>
+              </w:rPr>
+              <w:t>A</w:t>
+            </w:r>
+          </w:p>
+        </w:tc>
+      </w:tr>
+      <w:tr>
+        <w:tc>
+          <w:tcPr>
+            <w:tcW w:w="2857" w:type="dxa"/>
+          </w:tcPr>
+          <w:p>
+            <w:pPr>
+              <w:rPr>
+                <w:highlight w:val="cyan"/>
+                <w:lang w:val="en-NZ"/>
+              </w:rPr>
+            </w:pPr>
+            <w:r>
+              <w:rPr>
+                <w:highlight w:val="cyan"/>
+                <w:lang w:val="en-NZ"/>
+              </w:rPr>
+              <w:t>Acquisition of forensic datasets/disk images for analysis</w:t>
+            </w:r>
+          </w:p>
+        </w:tc>
+        <w:tc>
+          <w:tcPr>
+            <w:tcW w:w="1255" w:type="dxa"/>
+          </w:tcPr>
+          <w:p>
+            <w:pPr>
+              <w:rPr>
+                <w:highlight w:val="green"/>
+                <w:lang w:val="en-NZ"/>
+              </w:rPr>
+            </w:pPr>
+            <w:r>
+              <w:rPr>
+                <w:highlight w:val="green"/>
+                <w:lang w:val="en-NZ"/>
+              </w:rPr>
+              <w:t>I</w:t>
+            </w:r>
+          </w:p>
+        </w:tc>
+        <w:tc>
+          <w:tcPr>
+            <w:tcW w:w="1482" w:type="dxa"/>
+          </w:tcPr>
+          <w:p>
+            <w:pPr>
+              <w:rPr>
+                <w:highlight w:val="green"/>
+                <w:lang w:val="en-NZ"/>
+              </w:rPr>
+            </w:pPr>
+            <w:r>
+              <w:rPr>
+                <w:highlight w:val="green"/>
+                <w:lang w:val="en-NZ"/>
+              </w:rPr>
+              <w:t>I</w:t>
+            </w:r>
+          </w:p>
+        </w:tc>
+        <w:tc>
+          <w:tcPr>
+            <w:tcW w:w="1439" w:type="dxa"/>
+          </w:tcPr>
+          <w:p>
+            <w:pPr>
+              <w:rPr>
+                <w:highlight w:val="yellow"/>
+                <w:lang w:val="en-NZ"/>
+              </w:rPr>
+            </w:pPr>
+            <w:r>
+              <w:rPr>
+                <w:highlight w:val="yellow"/>
+                <w:lang w:val="en-NZ"/>
+              </w:rPr>
+              <w:t>C</w:t>
+            </w:r>
+          </w:p>
+        </w:tc>
+        <w:tc>
+          <w:tcPr>
+            <w:tcW w:w="1162" w:type="dxa"/>
+          </w:tcPr>
+          <w:p>
+            <w:pPr>
+              <w:rPr>
+                <w:highlight w:val="yellow"/>
+                <w:lang w:val="en-NZ"/>
+              </w:rPr>
+            </w:pPr>
+            <w:r>
+              <w:rPr>
+                <w:highlight w:val="yellow"/>
+                <w:lang w:val="en-NZ"/>
+              </w:rPr>
+              <w:t>C</w:t>
+            </w:r>
+          </w:p>
+        </w:tc>
+        <w:tc>
+          <w:tcPr>
+            <w:tcW w:w="1147" w:type="dxa"/>
+          </w:tcPr>
+          <w:p>
+            <w:pPr>
+              <w:rPr>
+                <w:lang w:val="en-NZ"/>
+              </w:rPr>
+            </w:pPr>
+            <w:r>
+              <w:rPr>
+                <w:highlight w:val="red"/>
+                <w:lang w:val="en-NZ"/>
+              </w:rPr>
+              <w:t>R</w:t>
+            </w:r>
+          </w:p>
+        </w:tc>
+        <w:tc>
+          <w:tcPr>
+            <w:tcW w:w="1114" w:type="dxa"/>
+          </w:tcPr>
+          <w:p>
+            <w:pPr>
+              <w:rPr>
+                <w:lang w:val="en-NZ"/>
+              </w:rPr>
+            </w:pPr>
+            <w:r>
+              <w:rPr>
+                <w:highlight w:val="yellow"/>
+                <w:lang w:val="en-NZ"/>
+              </w:rPr>
+              <w:t>C</w:t>
+            </w:r>
+          </w:p>
+        </w:tc>
+      </w:tr>
+      <w:tr>
+        <w:tc>
+          <w:tcPr>
+            <w:tcW w:w="2857" w:type="dxa"/>
+          </w:tcPr>
+          <w:p>
+            <w:pPr>
+              <w:rPr>
+                <w:highlight w:val="cyan"/>
+                <w:lang w:val="en-NZ"/>
+              </w:rPr>
+            </w:pPr>
+            <w:r>
+              <w:rPr>
+                <w:highlight w:val="cyan"/>
+                <w:lang w:val="en-NZ"/>
+              </w:rPr>
+              <w:t>AI integration with digital forensics tools</w:t>
+            </w:r>
+          </w:p>
+        </w:tc>
+        <w:tc>
+          <w:tcPr>
+            <w:tcW w:w="1255" w:type="dxa"/>
+          </w:tcPr>
+          <w:p>
+            <w:pPr>
+              <w:rPr>
+                <w:lang w:val="en-NZ"/>
+              </w:rPr>
+            </w:pPr>
+            <w:r>
+              <w:rPr>
+                <w:highlight w:val="yellow"/>
+                <w:lang w:val="en-NZ"/>
+              </w:rPr>
+              <w:t>C</w:t>
+            </w:r>
+          </w:p>
+        </w:tc>
+        <w:tc>
+          <w:tcPr>
+            <w:tcW w:w="1482" w:type="dxa"/>
+          </w:tcPr>
+          <w:p>
+            <w:pPr>
+              <w:rPr>
+                <w:lang w:val="en-NZ"/>
+              </w:rPr>
+            </w:pPr>
+            <w:r>
+              <w:rPr>
+                <w:highlight w:val="green"/>
+                <w:lang w:val="en-NZ"/>
+              </w:rPr>
+              <w:t>I</w:t>
+            </w:r>
+          </w:p>
+        </w:tc>
+        <w:tc>
+          <w:tcPr>
+            <w:tcW w:w="1439" w:type="dxa"/>
+          </w:tcPr>
+          <w:p>
+            <w:pPr>
+              <w:rPr>
+                <w:lang w:val="en-NZ"/>
+              </w:rPr>
+            </w:pPr>
+            <w:r>
+              <w:rPr>
+                <w:highlight w:val="yellow"/>
+                <w:lang w:val="en-NZ"/>
+              </w:rPr>
+              <w:t>C</w:t>
+            </w:r>
+          </w:p>
+        </w:tc>
+        <w:tc>
+          <w:tcPr>
+            <w:tcW w:w="1162" w:type="dxa"/>
+          </w:tcPr>
+          <w:p>
+            <w:pPr>
+              <w:rPr>
+                <w:lang w:val="en-NZ"/>
+              </w:rPr>
+            </w:pPr>
+            <w:r>
+              <w:rPr>
+                <w:highlight w:val="red"/>
+                <w:lang w:val="en-NZ"/>
+              </w:rPr>
+              <w:t>R</w:t>
+            </w:r>
+          </w:p>
+        </w:tc>
+        <w:tc>
+          <w:tcPr>
+            <w:tcW w:w="1147" w:type="dxa"/>
+          </w:tcPr>
+          <w:p>
+            <w:pPr>
+              <w:rPr>
+                <w:highlight w:val="yellow"/>
+                <w:lang w:val="en-NZ"/>
+              </w:rPr>
+            </w:pPr>
+            <w:r>
+              <w:rPr>
+                <w:highlight w:val="yellow"/>
+                <w:lang w:val="en-NZ"/>
+              </w:rPr>
+              <w:t>C</w:t>
+            </w:r>
+          </w:p>
+        </w:tc>
+        <w:tc>
+          <w:tcPr>
+            <w:tcW w:w="1114" w:type="dxa"/>
+          </w:tcPr>
+          <w:p>
+            <w:pPr>
+              <w:rPr>
+                <w:highlight w:val="yellow"/>
+                <w:lang w:val="en-NZ"/>
+              </w:rPr>
+            </w:pPr>
+            <w:r>
+              <w:rPr>
+                <w:highlight w:val="yellow"/>
+                <w:lang w:val="en-NZ"/>
+              </w:rPr>
+              <w:t>C</w:t>
+            </w:r>
+          </w:p>
+        </w:tc>
+      </w:tr>
+      <w:tr>
+        <w:tc>
+          <w:tcPr>
+            <w:tcW w:w="2857" w:type="dxa"/>
+          </w:tcPr>
+          <w:p>
+            <w:pPr>
+              <w:rPr>
+                <w:highlight w:val="cyan"/>
+                <w:lang w:val="en-NZ"/>
+              </w:rPr>
+            </w:pPr>
+            <w:r>
+              <w:rPr>
+                <w:highlight w:val="cyan"/>
+                <w:lang w:val="en-NZ"/>
+              </w:rPr>
+              <w:t xml:space="preserve">Creation or adaption of </w:t>
+            </w:r>
+            <w:r>
+              <w:rPr>
+                <w:highlight w:val="cyan"/>
+                <w:lang w:val="en-NZ"/>
+              </w:rPr>
+              <w:t xml:space="preserve">a </w:t>
+            </w:r>
+            <w:r>
+              <w:rPr>
+                <w:highlight w:val="cyan"/>
+                <w:lang w:val="en-NZ"/>
+              </w:rPr>
+              <w:t xml:space="preserve">process </w:t>
+            </w:r>
+            <w:r>
+              <w:rPr>
+                <w:highlight w:val="cyan"/>
+                <w:lang w:val="en-NZ"/>
+              </w:rPr>
+              <w:t xml:space="preserve">(CFTT) </w:t>
+            </w:r>
+            <w:r>
+              <w:rPr>
+                <w:highlight w:val="cyan"/>
+                <w:lang w:val="en-NZ"/>
+              </w:rPr>
+              <w:t xml:space="preserve">and </w:t>
+            </w:r>
+            <w:r>
+              <w:rPr>
+                <w:highlight w:val="cyan"/>
+                <w:lang w:val="en-NZ"/>
+              </w:rPr>
+              <w:t xml:space="preserve">metrics with which to objectively assess the efficacy of </w:t>
+            </w:r>
+            <w:r>
+              <w:rPr>
+                <w:highlight w:val="cyan"/>
+                <w:lang w:val="en-NZ"/>
+              </w:rPr>
+              <w:t xml:space="preserve">two or more </w:t>
+            </w:r>
+            <w:r>
+              <w:rPr>
+                <w:highlight w:val="cyan"/>
+                <w:lang w:val="en-NZ"/>
+              </w:rPr>
+              <w:t>tools.</w:t>
+            </w:r>
+          </w:p>
+        </w:tc>
+        <w:tc>
+          <w:tcPr>
+            <w:tcW w:w="1255" w:type="dxa"/>
+          </w:tcPr>
+          <w:p>
+            <w:pPr>
+              <w:rPr>
+                <w:highlight w:val="yellow"/>
+                <w:lang w:val="en-NZ"/>
+              </w:rPr>
+            </w:pPr>
+            <w:r>
+              <w:rPr>
+                <w:highlight w:val="yellow"/>
+                <w:lang w:val="en-NZ"/>
+              </w:rPr>
+              <w:t>C</w:t>
+            </w:r>
+          </w:p>
+        </w:tc>
+        <w:tc>
+          <w:tcPr>
+            <w:tcW w:w="1482" w:type="dxa"/>
+          </w:tcPr>
+          <w:p>
+            <w:pPr>
+              <w:rPr>
+                <w:highlight w:val="yellow"/>
+                <w:lang w:val="en-NZ"/>
+              </w:rPr>
+            </w:pPr>
+            <w:r>
+              <w:rPr>
+                <w:highlight w:val="yellow"/>
+                <w:lang w:val="en-NZ"/>
+              </w:rPr>
+              <w:t>C</w:t>
+            </w:r>
+          </w:p>
+        </w:tc>
+        <w:tc>
+          <w:tcPr>
+            <w:tcW w:w="1439" w:type="dxa"/>
+          </w:tcPr>
+          <w:p>
+            <w:pPr>
+              <w:rPr>
+                <w:highlight w:val="red"/>
+                <w:lang w:val="en-NZ"/>
+              </w:rPr>
+            </w:pPr>
+            <w:r>
+              <w:rPr>
+                <w:highlight w:val="red"/>
+                <w:lang w:val="en-NZ"/>
+              </w:rPr>
+              <w:t>R</w:t>
+            </w:r>
+          </w:p>
+        </w:tc>
+        <w:tc>
+          <w:tcPr>
+            <w:tcW w:w="1162" w:type="dxa"/>
+          </w:tcPr>
+          <w:p>
+            <w:pPr>
+              <w:rPr>
+                <w:highlight w:val="magenta"/>
+                <w:lang w:val="en-NZ"/>
+              </w:rPr>
+            </w:pPr>
+            <w:r>
+              <w:rPr>
+                <w:highlight w:val="magenta"/>
+                <w:lang w:val="en-NZ"/>
+              </w:rPr>
+              <w:t>A</w:t>
+            </w:r>
+          </w:p>
+        </w:tc>
+        <w:tc>
+          <w:tcPr>
+            <w:tcW w:w="1147" w:type="dxa"/>
+          </w:tcPr>
+          <w:p>
+            <w:pPr>
+              <w:rPr>
+                <w:highlight w:val="magenta"/>
+                <w:lang w:val="en-NZ"/>
+              </w:rPr>
+            </w:pPr>
+            <w:r>
+              <w:rPr>
+                <w:highlight w:val="magenta"/>
+                <w:lang w:val="en-NZ"/>
+              </w:rPr>
+              <w:t>A</w:t>
+            </w:r>
+          </w:p>
+        </w:tc>
+        <w:tc>
+          <w:tcPr>
+            <w:tcW w:w="1114" w:type="dxa"/>
+          </w:tcPr>
+          <w:p>
+            <w:pPr>
+              <w:rPr>
+                <w:highlight w:val="magenta"/>
+                <w:lang w:val="en-NZ"/>
+              </w:rPr>
+            </w:pPr>
+            <w:r>
+              <w:rPr>
+                <w:highlight w:val="magenta"/>
+                <w:lang w:val="en-NZ"/>
+              </w:rPr>
+              <w:t>A</w:t>
+            </w:r>
+          </w:p>
+        </w:tc>
+      </w:tr>
+      <w:tr>
+        <w:tc>
+          <w:tcPr>
+            <w:tcW w:w="2857" w:type="dxa"/>
+          </w:tcPr>
+          <w:p>
+            <w:pPr>
+              <w:rPr>
+                <w:highlight w:val="cyan"/>
+                <w:lang w:val="en-NZ"/>
+              </w:rPr>
+            </w:pPr>
+            <w:r>
+              <w:rPr>
+                <w:highlight w:val="cyan"/>
+                <w:lang w:val="en-NZ"/>
+              </w:rPr>
+              <w:t>Documentation and measuring of results of testing.</w:t>
+            </w:r>
+          </w:p>
+        </w:tc>
+        <w:tc>
+          <w:tcPr>
+            <w:tcW w:w="1255" w:type="dxa"/>
+          </w:tcPr>
+          <w:p>
+            <w:pPr>
+              <w:rPr>
+                <w:highlight w:val="yellow"/>
+                <w:lang w:val="en-NZ"/>
+              </w:rPr>
+            </w:pPr>
+            <w:r>
+              <w:rPr>
+                <w:highlight w:val="yellow"/>
+                <w:lang w:val="en-NZ"/>
+              </w:rPr>
+              <w:t>C</w:t>
+            </w:r>
+          </w:p>
+        </w:tc>
+        <w:tc>
+          <w:tcPr>
+            <w:tcW w:w="1482" w:type="dxa"/>
+          </w:tcPr>
+          <w:p>
+            <w:pPr>
+              <w:rPr>
+                <w:highlight w:val="yellow"/>
+                <w:lang w:val="en-NZ"/>
+              </w:rPr>
+            </w:pPr>
+            <w:r>
+              <w:rPr>
+                <w:highlight w:val="yellow"/>
+                <w:lang w:val="en-NZ"/>
+              </w:rPr>
+              <w:t>C</w:t>
+            </w:r>
+          </w:p>
+        </w:tc>
+        <w:tc>
+          <w:tcPr>
+            <w:tcW w:w="1439" w:type="dxa"/>
+          </w:tcPr>
+          <w:p>
+            <w:pPr>
+              <w:rPr>
+                <w:highlight w:val="yellow"/>
+                <w:lang w:val="en-NZ"/>
+              </w:rPr>
+            </w:pPr>
+            <w:r>
+              <w:rPr>
+                <w:highlight w:val="yellow"/>
+                <w:lang w:val="en-NZ"/>
+              </w:rPr>
+              <w:t>C</w:t>
+            </w:r>
+          </w:p>
+        </w:tc>
+        <w:tc>
+          <w:tcPr>
+            <w:tcW w:w="1162" w:type="dxa"/>
+          </w:tcPr>
+          <w:p>
+            <w:pPr>
+              <w:rPr>
+                <w:lang w:val="en-NZ"/>
+              </w:rPr>
+            </w:pPr>
+            <w:r>
+              <w:rPr>
+                <w:highlight w:val="red"/>
+                <w:lang w:val="en-NZ"/>
+              </w:rPr>
+              <w:t>R</w:t>
+            </w:r>
+          </w:p>
+        </w:tc>
+        <w:tc>
+          <w:tcPr>
+            <w:tcW w:w="1147" w:type="dxa"/>
+          </w:tcPr>
+          <w:p>
+            <w:pPr>
+              <w:rPr>
+                <w:lang w:val="en-NZ"/>
+              </w:rPr>
+            </w:pPr>
+            <w:r>
+              <w:rPr>
+                <w:highlight w:val="red"/>
+                <w:lang w:val="en-NZ"/>
+              </w:rPr>
+              <w:t>R</w:t>
+            </w:r>
+          </w:p>
+        </w:tc>
+        <w:tc>
+          <w:tcPr>
+            <w:tcW w:w="1114" w:type="dxa"/>
+          </w:tcPr>
+          <w:p>
+            <w:pPr>
+              <w:rPr>
+                <w:lang w:val="en-NZ"/>
+              </w:rPr>
+            </w:pPr>
+            <w:r>
+              <w:rPr>
+                <w:highlight w:val="red"/>
+                <w:lang w:val="en-NZ"/>
+              </w:rPr>
+              <w:t>R</w:t>
+            </w:r>
+          </w:p>
+        </w:tc>
+      </w:tr>
+      <w:tr>
+        <w:tc>
+          <w:tcPr>
+            <w:tcW w:w="2857" w:type="dxa"/>
+          </w:tcPr>
+          <w:p>
+            <w:pPr>
+              <w:rPr>
+                <w:highlight w:val="cyan"/>
+                <w:lang w:val="en-NZ"/>
+              </w:rPr>
+            </w:pPr>
+            <w:r>
+              <w:rPr>
+                <w:highlight w:val="cyan"/>
+                <w:lang w:val="en-NZ"/>
+              </w:rPr>
+              <w:t>Testing in multiple evidence environments (mobile/</w:t>
+            </w:r>
+            <w:r>
+              <w:rPr>
+                <w:highlight w:val="cyan"/>
+                <w:lang w:val="en-NZ"/>
+              </w:rPr>
+              <w:t>desktop</w:t>
+            </w:r>
+            <w:r>
+              <w:rPr>
+                <w:highlight w:val="cyan"/>
+                <w:lang w:val="en-NZ"/>
+              </w:rPr>
+              <w:t xml:space="preserve">) on multiple types of target data </w:t>
+            </w:r>
+            <w:r>
+              <w:rPr>
+                <w:highlight w:val="cyan"/>
+                <w:lang w:val="en-NZ"/>
+              </w:rPr>
+              <w:t xml:space="preserve">(credentials, </w:t>
+            </w:r>
+            <w:r>
+              <w:rPr>
+                <w:highlight w:val="cyan"/>
+                <w:lang w:val="en-NZ"/>
+              </w:rPr>
+              <w:lastRenderedPageBreak/>
+              <w:t>confidential information, intrusion indicators, suspicious processes/media)</w:t>
+            </w:r>
+          </w:p>
+        </w:tc>
+        <w:tc>
+          <w:tcPr>
+            <w:tcW w:w="1255" w:type="dxa"/>
+          </w:tcPr>
+          <w:p>
+            <w:pPr>
+              <w:rPr>
+                <w:highlight w:val="green"/>
+                <w:lang w:val="en-NZ"/>
+              </w:rPr>
+            </w:pPr>
+            <w:r>
+              <w:rPr>
+                <w:highlight w:val="green"/>
+                <w:lang w:val="en-NZ"/>
+              </w:rPr>
+              <w:lastRenderedPageBreak/>
+              <w:t>I</w:t>
+            </w:r>
+          </w:p>
+        </w:tc>
+        <w:tc>
+          <w:tcPr>
+            <w:tcW w:w="1482" w:type="dxa"/>
+          </w:tcPr>
+          <w:p>
+            <w:pPr>
+              <w:rPr>
+                <w:highlight w:val="green"/>
+                <w:lang w:val="en-NZ"/>
+              </w:rPr>
+            </w:pPr>
+            <w:r>
+              <w:rPr>
+                <w:highlight w:val="green"/>
+                <w:lang w:val="en-NZ"/>
+              </w:rPr>
+              <w:t>I</w:t>
+            </w:r>
+          </w:p>
+        </w:tc>
+        <w:tc>
+          <w:tcPr>
+            <w:tcW w:w="1439" w:type="dxa"/>
+          </w:tcPr>
+          <w:p>
+            <w:pPr>
+              <w:rPr>
+                <w:lang w:val="en-NZ"/>
+              </w:rPr>
+            </w:pPr>
+            <w:r>
+              <w:rPr>
+                <w:highlight w:val="yellow"/>
+                <w:lang w:val="en-NZ"/>
+              </w:rPr>
+              <w:t>C</w:t>
+            </w:r>
+          </w:p>
+        </w:tc>
+        <w:tc>
+          <w:tcPr>
+            <w:tcW w:w="1162" w:type="dxa"/>
+          </w:tcPr>
+          <w:p>
+            <w:pPr>
+              <w:rPr>
+                <w:highlight w:val="red"/>
+                <w:lang w:val="en-NZ"/>
+              </w:rPr>
+            </w:pPr>
+            <w:r>
+              <w:rPr>
+                <w:highlight w:val="red"/>
+                <w:lang w:val="en-NZ"/>
+              </w:rPr>
+              <w:t>R</w:t>
+            </w:r>
+          </w:p>
+        </w:tc>
+        <w:tc>
+          <w:tcPr>
+            <w:tcW w:w="1147" w:type="dxa"/>
+          </w:tcPr>
+          <w:p>
+            <w:pPr>
+              <w:rPr>
+                <w:highlight w:val="red"/>
+                <w:lang w:val="en-NZ"/>
+              </w:rPr>
+            </w:pPr>
+            <w:r>
+              <w:rPr>
+                <w:highlight w:val="red"/>
+                <w:lang w:val="en-NZ"/>
+              </w:rPr>
+              <w:t>R</w:t>
+            </w:r>
+          </w:p>
+        </w:tc>
+        <w:tc>
+          <w:tcPr>
+            <w:tcW w:w="1114" w:type="dxa"/>
+          </w:tcPr>
+          <w:p>
+            <w:pPr>
+              <w:rPr>
+                <w:lang w:val="en-NZ"/>
+              </w:rPr>
+            </w:pPr>
+            <w:r>
+              <w:rPr>
+                <w:highlight w:val="yellow"/>
+                <w:lang w:val="en-NZ"/>
+              </w:rPr>
+              <w:t>C</w:t>
+            </w:r>
+          </w:p>
+        </w:tc>
+      </w:tr>
+      <w:tr>
+        <w:tc>
+          <w:tcPr>
+            <w:tcW w:w="2857" w:type="dxa"/>
+          </w:tcPr>
+          <w:p>
+            <w:pPr>
+              <w:rPr>
+                <w:highlight w:val="cyan"/>
+                <w:lang w:val="en-NZ"/>
+              </w:rPr>
+            </w:pPr>
+            <w:r>
+              <w:rPr>
+                <w:highlight w:val="cyan"/>
+                <w:lang w:val="en-NZ"/>
+              </w:rPr>
+              <w:t xml:space="preserve">Design a consistent test environment, ensuring all variables are the same and that </w:t>
+            </w:r>
+            <w:r>
+              <w:rPr>
+                <w:highlight w:val="cyan"/>
+                <w:lang w:val="en-NZ"/>
+              </w:rPr>
+              <w:t>available processing power is consistent before testing.</w:t>
+            </w:r>
+            <w:r>
+              <w:rPr>
+                <w:highlight w:val="cyan"/>
+                <w:lang w:val="en-NZ"/>
+              </w:rPr>
+              <w:t xml:space="preserve"> </w:t>
+            </w:r>
+          </w:p>
+        </w:tc>
+        <w:tc>
+          <w:tcPr>
+            <w:tcW w:w="1255" w:type="dxa"/>
+          </w:tcPr>
+          <w:p>
+            <w:pPr>
+              <w:rPr>
+                <w:highlight w:val="green"/>
+                <w:lang w:val="en-NZ"/>
+              </w:rPr>
+            </w:pPr>
+            <w:r>
+              <w:rPr>
+                <w:highlight w:val="green"/>
+                <w:lang w:val="en-NZ"/>
+              </w:rPr>
+              <w:t>I</w:t>
+            </w:r>
+          </w:p>
+        </w:tc>
+        <w:tc>
+          <w:tcPr>
+            <w:tcW w:w="1482" w:type="dxa"/>
+          </w:tcPr>
+          <w:p>
+            <w:pPr>
+              <w:rPr>
+                <w:highlight w:val="green"/>
+                <w:lang w:val="en-NZ"/>
+              </w:rPr>
+            </w:pPr>
+            <w:r>
+              <w:rPr>
+                <w:highlight w:val="green"/>
+                <w:lang w:val="en-NZ"/>
+              </w:rPr>
+              <w:t>I</w:t>
+            </w:r>
+          </w:p>
+        </w:tc>
+        <w:tc>
+          <w:tcPr>
+            <w:tcW w:w="1439" w:type="dxa"/>
+          </w:tcPr>
+          <w:p>
+            <w:pPr>
+              <w:rPr>
+                <w:lang w:val="en-NZ"/>
+              </w:rPr>
+            </w:pPr>
+            <w:r>
+              <w:rPr>
+                <w:highlight w:val="yellow"/>
+                <w:lang w:val="en-NZ"/>
+              </w:rPr>
+              <w:t>C</w:t>
+            </w:r>
+          </w:p>
+        </w:tc>
+        <w:tc>
+          <w:tcPr>
+            <w:tcW w:w="1162" w:type="dxa"/>
+          </w:tcPr>
+          <w:p>
+            <w:pPr>
+              <w:rPr>
+                <w:highlight w:val="red"/>
+                <w:lang w:val="en-NZ"/>
+              </w:rPr>
+            </w:pPr>
+            <w:r>
+              <w:rPr>
+                <w:highlight w:val="red"/>
+                <w:lang w:val="en-NZ"/>
+              </w:rPr>
+              <w:t>R</w:t>
+            </w:r>
+          </w:p>
+        </w:tc>
+        <w:tc>
+          <w:tcPr>
+            <w:tcW w:w="1147" w:type="dxa"/>
+          </w:tcPr>
+          <w:p>
+            <w:pPr>
+              <w:rPr>
+                <w:highlight w:val="red"/>
+                <w:lang w:val="en-NZ"/>
+              </w:rPr>
+            </w:pPr>
+            <w:r>
+              <w:rPr>
+                <w:highlight w:val="red"/>
+                <w:lang w:val="en-NZ"/>
+              </w:rPr>
+              <w:t>R</w:t>
+            </w:r>
+          </w:p>
+        </w:tc>
+        <w:tc>
+          <w:tcPr>
+            <w:tcW w:w="1114" w:type="dxa"/>
+          </w:tcPr>
+          <w:p>
+            <w:pPr>
+              <w:rPr>
+                <w:highlight w:val="red"/>
+                <w:lang w:val="en-NZ"/>
+              </w:rPr>
+            </w:pPr>
+            <w:r>
+              <w:rPr>
+                <w:highlight w:val="red"/>
+                <w:lang w:val="en-NZ"/>
+              </w:rPr>
+              <w:t>R</w:t>
+            </w:r>
+          </w:p>
+        </w:tc>
+      </w:tr>
+    </w:tbl>
+    <w:p>
+      <w:pPr>
+        <w:rPr>
+          <w:lang w:val="en-NZ"/>
+        </w:rPr>
+      </w:pPr>
+    </w:p>
+    <w:p>
+      <w:pPr>
+        <w:rPr>
+          <w:lang w:val="en-NZ"/>
+        </w:rPr>
+      </w:pPr>
+    </w:p>
+    <w:p>
+      <w:pPr>
+        <w:rPr>
+          <w:lang w:val="en-NZ"/>
+        </w:rPr>
+      </w:pPr>
+    </w:p>
+    <w:p>
+      <w:pPr>
+        <w:rPr>
+          <w:lang w:val="en-NZ"/>
+        </w:rPr>
+      </w:pPr>
+    </w:p>
+    <w:p>
+      <w:pPr>
+        <w:rPr>
+          <w:lang w:val="en-NZ"/>
+        </w:rPr>
+      </w:pPr>
+    </w:p>
+    <w:p>
+      <w:pPr>
+        <w:rPr>
+          <w:lang w:val="en-NZ"/>
+        </w:rPr>
+      </w:pPr>
+    </w:p>
+    <w:p>
+      <w:pPr>
+        <w:rPr>
+          <w:lang w:val="en-NZ"/>
+        </w:rPr>
+      </w:pPr>
+    </w:p>
+    <w:p>
+      <w:pPr>
+        <w:rPr>
+          <w:lang w:val="en-NZ"/>
+        </w:rPr>
+      </w:pPr>
+    </w:p>
+    <w:p>
+      <w:pPr>
+        <w:rPr>
+          <w:lang w:val="en-NZ"/>
+        </w:rPr>
+      </w:pPr>
+    </w:p>
+    <w:p>
+      <w:pPr>
+        <w:rPr>
+          <w:lang w:val="en-NZ"/>
+        </w:rPr>
+      </w:pPr>
+    </w:p>
+    <w:p>
+      <w:pPr>
+        <w:rPr>
+          <w:lang w:val="en-NZ"/>
+        </w:rPr>
+      </w:pPr>
+    </w:p>
+    <w:p>
+      <w:pPr>
+        <w:rPr>
+          <w:lang w:val="en-NZ"/>
+        </w:rPr>
+      </w:pPr>
+    </w:p>
+    <w:p>
+      <w:pPr>
+        <w:rPr>
+          <w:lang w:val="en-NZ"/>
+        </w:rPr>
+      </w:pPr>
+    </w:p>
+    <w:p>
+      <w:pPr>
+        <w:rPr>
+          <w:lang w:val="en-NZ"/>
+        </w:rPr>
+      </w:pPr>
+    </w:p>
+    <w:p>
+      <w:pPr>
+        <w:rPr>
+          <w:lang w:val="en-NZ"/>
+        </w:rPr>
+      </w:pPr>
+    </w:p>
+    <w:p>
+      <w:pPr>
+        <w:rPr>
+          <w:lang w:val="en-NZ"/>
+        </w:rPr>
+      </w:pPr>
+    </w:p>
+    <w:p>
+      <w:pPr>
+        <w:rPr>
+          <w:lang w:val="en-NZ"/>
+        </w:rPr>
+      </w:pPr>
+    </w:p>
+    <w:p>
+      <w:pPr>
+        <w:rPr>
+          <w:lang w:val="en-NZ"/>
+        </w:rPr>
+      </w:pPr>
+    </w:p>
+    <w:p>
+      <w:pPr>
+        <w:rPr>
+          <w:lang w:val="en-NZ"/>
+        </w:rPr>
+      </w:pPr>
+    </w:p>
+    <w:p>
+      <w:pPr>
+        <w:rPr>
+          <w:lang w:val="en-NZ"/>
+        </w:rPr>
+      </w:pPr>
+    </w:p>
+    <w:p>
+      <w:pPr>
+        <w:rPr>
+          <w:lang w:val="en-NZ"/>
+        </w:rPr>
+      </w:pPr>
+    </w:p>
+    <w:p>
+      <w:pPr>
+        <w:rPr>
+          <w:lang w:val="en-NZ"/>
+        </w:rPr>
+      </w:pPr>
+    </w:p>
+    <w:p>
+      <w:pPr>
+        <w:rPr>
+          <w:lang w:val="en-NZ"/>
+        </w:rPr>
+      </w:pPr>
+    </w:p>
+    <w:p>
+      <w:pPr>
+        <w:rPr>
+          <w:lang w:val="en-NZ"/>
+        </w:rPr>
+      </w:pPr>
+    </w:p>
+    <w:p>
+      <w:pPr>
+        <w:rPr>
+          <w:lang w:val="en-NZ"/>
+        </w:rPr>
+      </w:pPr>
+    </w:p>
+    <w:p>
+      <w:pPr>
+        <w:rPr>
+          <w:lang w:val="en-NZ"/>
+        </w:rPr>
+      </w:pPr>
+    </w:p>
+    <w:p>
+      <w:pPr>
+        <w:rPr>
+          <w:lang w:val="en-NZ"/>
+        </w:rPr>
+      </w:pPr>
+    </w:p>
+    <w:p>
+      <w:pPr>
+        <w:rPr>
+          <w:lang w:val="en-NZ"/>
+        </w:rPr>
+      </w:pPr>
+    </w:p>
+    <w:p>
+      <w:pPr>
+        <w:rPr>
+          <w:lang w:val="en-NZ"/>
+        </w:rPr>
+      </w:pPr>
+    </w:p>
+    <w:p>
+      <w:pPr>
+        <w:rPr>
+          <w:lang w:val="en-NZ"/>
+        </w:rPr>
+      </w:pPr>
+    </w:p>
+    <w:p>
+      <w:pPr>
+        <w:rPr>
+          <w:lang w:val="en-NZ"/>
+        </w:rPr>
+      </w:pPr>
+    </w:p>
+    <w:p>
+      <w:pPr>
+        <w:rPr>
+          <w:lang w:val="en-NZ"/>
+        </w:rPr>
+      </w:pPr>
+    </w:p>
+    <w:p>
+      <w:pPr>
+        <w:rPr>
+          <w:lang w:val="en-NZ"/>
+        </w:rPr>
+      </w:pPr>
+    </w:p>
+    <w:p>
+      <w:pPr>
+        <w:rPr>
+          <w:lang w:val="en-NZ"/>
+        </w:rPr>
+      </w:pPr>
+    </w:p>
+    <w:p>
+      <w:pPr>
+        <w:rPr>
+          <w:lang w:val="en-NZ"/>
+        </w:rPr>
+      </w:pPr>
+    </w:p>
+    <w:p>
+      <w:pPr>
+        <w:rPr>
+          <w:lang w:val="en-NZ"/>
+        </w:rPr>
+      </w:pPr>
+    </w:p>
+    <w:p>
+      <w:pPr>
+        <w:rPr>
+          <w:lang w:val="en-NZ"/>
+        </w:rPr>
+      </w:pPr>
+    </w:p>
+    <w:p>
+      <w:pPr>
+        <w:rPr>
+          <w:lang w:val="en-NZ"/>
+        </w:rPr>
+      </w:pPr>
+    </w:p>
+    <w:p>
+      <w:pPr>
+        <w:rPr>
+          <w:lang w:val="en-NZ"/>
+        </w:rPr>
+      </w:pPr>
     </w:p>
     <w:p>
       <w:pPr>
@@ -7965,6 +9938,7 @@
                 <w:bCs/>
                 <w:lang w:val="en-NZ"/>
               </w:rPr>
+              <w:lastRenderedPageBreak/>
               <w:t>5</w:t>
             </w:r>
           </w:p>
@@ -9229,6 +11203,7 @@
               <w:rPr>
                 <w:lang w:val="en-NZ"/>
               </w:rPr>
+              <w:lastRenderedPageBreak/>
               <w:t xml:space="preserve">R06 </w:t>
             </w:r>
             <w:r>
@@ -9819,7 +11794,6 @@
               <w:rPr>
                 <w:lang w:val="en-NZ"/>
               </w:rPr>
-              <w:lastRenderedPageBreak/>
               <w:t>R04 Formatting inconsistencies</w:t>
             </w:r>
           </w:p>
@@ -10257,6 +12231,7 @@
       </w:pPr>
       <w:bookmarkStart w:id="19" w:name="_Toc236665784"/>
       <w:r>
+        <w:lastRenderedPageBreak/>
         <w:t>References</w:t>
       </w:r>
       <w:bookmarkEnd w:id="19"/>
@@ -10391,7 +12366,6 @@
         <w:rPr>
           <w:lang w:val="en-NZ"/>
         </w:rPr>
-        <w:lastRenderedPageBreak/>
         <w:t>If the meeting is longer than 30 minutes, be sure to edit out content that is not required as long as</w:t>
       </w:r>
     </w:p>
@@ -10598,6 +12572,7 @@
       </w:pPr>
       <w:bookmarkStart w:id="26" w:name="_Toc236665791"/>
       <w:r>
+        <w:lastRenderedPageBreak/>
         <w:t>Weekly Group log Minutes</w:t>
       </w:r>
       <w:bookmarkEnd w:id="26"/>
@@ -10618,7 +12593,7 @@
       </w:r>
     </w:p>
     <w:sectPr>
-      <w:footerReference w:type="default" r:id="rId10"/>
+      <w:footerReference w:type="default" r:id="rId9"/>
       <w:pgSz w:w="11906" w:h="16838"/>
       <w:pgMar w:top="720" w:right="720" w:bottom="720" w:left="720" w:header="708" w:footer="708" w:gutter="0"/>
       <w:pgNumType w:start="0"/>

</xml_diff>

<commit_message>
finalized client portion of personnel section, approved by Geoff
</commit_message>
<xml_diff>
--- a/Proposal working/Matt - Project Personnel.docx
+++ b/Proposal working/Matt - Project Personnel.docx
@@ -3830,7 +3830,6 @@
                                     <w:szCs w:val="36"/>
                                   </w:rPr>
                                 </w:pPr>
-                                <w:proofErr w:type="spellStart"/>
                                 <w:r>
                                   <w:rPr>
                                     <w:color w:val="404040" w:themeColor="text1" w:themeTint="BF"/>
@@ -3839,7 +3838,6 @@
                                   </w:rPr>
                                   <w:t>WelTec</w:t>
                                 </w:r>
-                                <w:proofErr w:type="spellEnd"/>
                                 <w:r>
                                   <w:rPr>
                                     <w:color w:val="404040" w:themeColor="text1" w:themeTint="BF"/>
@@ -4100,7 +4098,7 @@
                                         </pic:cNvPicPr>
                                       </pic:nvPicPr>
                                       <pic:blipFill>
-                                        <a:blip r:embed="rId8">
+                                        <a:blip r:embed="rId9">
                                           <a:extLst>
                                             <a:ext uri="{28A0092B-C50C-407E-A947-70E740481C1C}">
                                               <a14:useLocalDpi xmlns:a14="http://schemas.microsoft.com/office/drawing/2010/main" val="0"/>
@@ -6511,7 +6509,6 @@
         </w:rPr>
         <w:t xml:space="preserve">Geoff Gordon is a staff member of </w:t>
       </w:r>
-      <w:proofErr w:type="spellStart"/>
       <w:r>
         <w:rPr>
           <w:highlight w:val="cyan"/>
@@ -6519,7 +6516,6 @@
         </w:rPr>
         <w:t>WelTec</w:t>
       </w:r>
-      <w:proofErr w:type="spellEnd"/>
       <w:r>
         <w:rPr>
           <w:highlight w:val="cyan"/>
@@ -6539,35 +6535,28 @@
           <w:highlight w:val="cyan"/>
           <w:lang w:val="en-NZ"/>
         </w:rPr>
-        <w:t xml:space="preserve"> He has familiarity, curiosity and deep interest in AI models and their behaviour, as well as their associated hardware/platforms. He is interested in an assessment of the data leakage that occurs when using cloud-hosted </w:t>
+        <w:t xml:space="preserve"> He has familiarity, curiosity and deep interest in AI models and their behaviour, as well as their associated hardware/platforms. </w:t>
       </w:r>
       <w:r>
         <w:rPr>
           <w:highlight w:val="cyan"/>
           <w:lang w:val="en-NZ"/>
         </w:rPr>
-        <w:t xml:space="preserve">AI </w:t>
+        <w:t>He is interested in whether AI is</w:t>
       </w:r>
       <w:r>
         <w:rPr>
           <w:highlight w:val="cyan"/>
           <w:lang w:val="en-NZ"/>
         </w:rPr>
-        <w:t xml:space="preserve">models for sensitive </w:t>
+        <w:t xml:space="preserve"> has a place</w:t>
       </w:r>
       <w:r>
         <w:rPr>
           <w:highlight w:val="cyan"/>
           <w:lang w:val="en-NZ"/>
         </w:rPr>
-        <w:t>work</w:t>
-      </w:r>
-      <w:r>
-        <w:rPr>
-          <w:highlight w:val="cyan"/>
-          <w:lang w:val="en-NZ"/>
-        </w:rPr>
-        <w:t xml:space="preserve"> such as digital forensics.</w:t>
+        <w:t xml:space="preserve"> in the field of digital forensics.</w:t>
       </w:r>
     </w:p>
     <w:p>
@@ -6581,7 +6570,21 @@
           <w:highlight w:val="cyan"/>
           <w:lang w:val="en-NZ"/>
         </w:rPr>
-        <w:t xml:space="preserve">Geoff has been the client on multiple previous </w:t>
+        <w:t>Geoff has been the client on multiple previous</w:t>
+      </w:r>
+      <w:r>
+        <w:rPr>
+          <w:highlight w:val="cyan"/>
+          <w:lang w:val="en-NZ"/>
+        </w:rPr>
+        <w:t xml:space="preserve"> capstone</w:t>
+      </w:r>
+      <w:r>
+        <w:rPr>
+          <w:highlight w:val="cyan"/>
+          <w:lang w:val="en-NZ"/>
+        </w:rPr>
+        <w:t xml:space="preserve"> </w:t>
       </w:r>
       <w:r>
         <w:rPr>
@@ -7238,16 +7241,8 @@
               <w:rPr>
                 <w:lang w:val="en-NZ"/>
               </w:rPr>
-              <w:t xml:space="preserve">Project advisor: Clement </w:t>
-            </w:r>
-            <w:proofErr w:type="spellStart"/>
-            <w:r>
-              <w:rPr>
-                <w:lang w:val="en-NZ"/>
-              </w:rPr>
-              <w:t>Swarnappa</w:t>
-            </w:r>
-            <w:proofErr w:type="spellEnd"/>
+              <w:t>Project advisor: Clement Swarnappa</w:t>
+            </w:r>
           </w:p>
         </w:tc>
         <w:tc>
@@ -7386,23 +7381,7 @@
                 <w:highlight w:val="cyan"/>
                 <w:lang w:val="en-NZ"/>
               </w:rPr>
-              <w:t>Olivia-</w:t>
-            </w:r>
-            <w:proofErr w:type="gramStart"/>
-            <w:r>
-              <w:rPr>
-                <w:highlight w:val="cyan"/>
-                <w:lang w:val="en-NZ"/>
-              </w:rPr>
-              <w:t>hey.hey</w:t>
-            </w:r>
-            <w:proofErr w:type="gramEnd"/>
-            <w:r>
-              <w:rPr>
-                <w:highlight w:val="cyan"/>
-                <w:lang w:val="en-NZ"/>
-              </w:rPr>
-              <w:t>01</w:t>
+              <w:t>Olivia-hey.hey01</w:t>
             </w:r>
           </w:p>
         </w:tc>
@@ -7616,29 +7595,7 @@
           <w:highlight w:val="cyan"/>
           <w:lang w:val="en-NZ"/>
         </w:rPr>
-        <w:t xml:space="preserve">Geoff Gordon is a member of the </w:t>
-      </w:r>
-      <w:proofErr w:type="spellStart"/>
-      <w:r>
-        <w:rPr>
-          <w:rFonts w:cs="Arial"/>
-          <w:sz w:val="24"/>
-          <w:szCs w:val="24"/>
-          <w:highlight w:val="cyan"/>
-          <w:lang w:val="en-NZ"/>
-        </w:rPr>
-        <w:t>WelTec</w:t>
-      </w:r>
-      <w:proofErr w:type="spellEnd"/>
-      <w:r>
-        <w:rPr>
-          <w:rFonts w:cs="Arial"/>
-          <w:sz w:val="24"/>
-          <w:szCs w:val="24"/>
-          <w:highlight w:val="cyan"/>
-          <w:lang w:val="en-NZ"/>
-        </w:rPr>
-        <w:t xml:space="preserve"> staff, </w:t>
+        <w:t xml:space="preserve">Geoff Gordon is a member of the WelTec staff, </w:t>
       </w:r>
       <w:r>
         <w:rPr>
@@ -7818,23 +7775,7 @@
                 <w:highlight w:val="cyan"/>
                 <w:lang w:val="en-NZ"/>
               </w:rPr>
-              <w:t xml:space="preserve">Clement </w:t>
-            </w:r>
-            <w:proofErr w:type="spellStart"/>
-            <w:r>
-              <w:rPr>
-                <w:highlight w:val="cyan"/>
-                <w:lang w:val="en-NZ"/>
-              </w:rPr>
-              <w:t>Swarnappa</w:t>
-            </w:r>
-            <w:proofErr w:type="spellEnd"/>
-            <w:r>
-              <w:rPr>
-                <w:highlight w:val="cyan"/>
-                <w:lang w:val="en-NZ"/>
-              </w:rPr>
-              <w:t xml:space="preserve"> (Advisor)</w:t>
+              <w:t>Clement Swarnappa (Advisor)</w:t>
             </w:r>
           </w:p>
         </w:tc>
@@ -8075,39 +8016,7 @@
                 <w:highlight w:val="cyan"/>
                 <w:lang w:val="en-NZ"/>
               </w:rPr>
-              <w:t>Installation/configuration of operating systems and software (</w:t>
-            </w:r>
-            <w:proofErr w:type="spellStart"/>
-            <w:r>
-              <w:rPr>
-                <w:highlight w:val="cyan"/>
-                <w:lang w:val="en-NZ"/>
-              </w:rPr>
-              <w:t>LMStudio</w:t>
-            </w:r>
-            <w:proofErr w:type="spellEnd"/>
-            <w:r>
-              <w:rPr>
-                <w:highlight w:val="cyan"/>
-                <w:lang w:val="en-NZ"/>
-              </w:rPr>
-              <w:t>, forensic tools such as volatility/</w:t>
-            </w:r>
-            <w:proofErr w:type="spellStart"/>
-            <w:r>
-              <w:rPr>
-                <w:highlight w:val="cyan"/>
-                <w:lang w:val="en-NZ"/>
-              </w:rPr>
-              <w:t>exiftools</w:t>
-            </w:r>
-            <w:proofErr w:type="spellEnd"/>
-            <w:r>
-              <w:rPr>
-                <w:highlight w:val="cyan"/>
-                <w:lang w:val="en-NZ"/>
-              </w:rPr>
-              <w:t>/foremost)</w:t>
+              <w:t>Installation/configuration of operating systems and software (LMStudio, forensic tools such as volatility/exiftools/foremost)</w:t>
             </w:r>
           </w:p>
         </w:tc>
@@ -12418,21 +12327,7 @@
         <w:rPr>
           <w:lang w:val="en-NZ"/>
         </w:rPr>
-        <w:t xml:space="preserve">If there are technical or other reasons why this cannot be </w:t>
-      </w:r>
-      <w:proofErr w:type="gramStart"/>
-      <w:r>
-        <w:rPr>
-          <w:lang w:val="en-NZ"/>
-        </w:rPr>
-        <w:t>done</w:t>
-      </w:r>
-      <w:proofErr w:type="gramEnd"/>
-      <w:r>
-        <w:rPr>
-          <w:lang w:val="en-NZ"/>
-        </w:rPr>
-        <w:t xml:space="preserve"> they need to be discussed with the</w:t>
+        <w:t>If there are technical or other reasons why this cannot be done they need to be discussed with the</w:t>
       </w:r>
       <w:r>
         <w:rPr>
@@ -12496,35 +12391,7 @@
         <w:rPr>
           <w:lang w:val="en-NZ"/>
         </w:rPr>
-        <w:t xml:space="preserve">either asking </w:t>
-      </w:r>
-      <w:proofErr w:type="spellStart"/>
-      <w:r>
-        <w:rPr>
-          <w:lang w:val="en-NZ"/>
-        </w:rPr>
-        <w:t>pātai</w:t>
-      </w:r>
-      <w:proofErr w:type="spellEnd"/>
-      <w:r>
-        <w:rPr>
-          <w:lang w:val="en-NZ"/>
-        </w:rPr>
-        <w:t xml:space="preserve">/questions of the client, or answering the client’s </w:t>
-      </w:r>
-      <w:proofErr w:type="spellStart"/>
-      <w:r>
-        <w:rPr>
-          <w:lang w:val="en-NZ"/>
-        </w:rPr>
-        <w:t>pātai</w:t>
-      </w:r>
-      <w:proofErr w:type="spellEnd"/>
-      <w:r>
-        <w:rPr>
-          <w:lang w:val="en-NZ"/>
-        </w:rPr>
-        <w:t>/questions.</w:t>
+        <w:t>either asking pātai/questions of the client, or answering the client’s pātai/questions.</w:t>
       </w:r>
     </w:p>
     <w:p>
@@ -12593,7 +12460,7 @@
       </w:r>
     </w:p>
     <w:sectPr>
-      <w:footerReference w:type="default" r:id="rId9"/>
+      <w:footerReference w:type="default" r:id="rId10"/>
       <w:pgSz w:w="11906" w:h="16838"/>
       <w:pgMar w:top="720" w:right="720" w:bottom="720" w:left="720" w:header="708" w:footer="708" w:gutter="0"/>
       <w:pgNumType w:start="0"/>

</xml_diff>